<commit_message>
Swissdec E3: Stammdaten Rechtseinheit (Tabelle, Endpoints, Erfassungskarte, XML-Anbindung)
</commit_message>
<xml_diff>
--- a/docs/Swissdec-Erstberatung-OneCrew.docx
+++ b/docs/Swissdec-Erstberatung-OneCrew.docx
@@ -155,15 +155,15 @@
           <w:sz w:val="21"/>
           <w:szCs w:val="21"/>
         </w:rPr>
-        <w:t xml:space="preserve">Eigenentwicklung für den Eigengebrauch</w:t>
-      </w:r>
-      <w:r>
-        <w:rPr>
-          <w:color w:val="3F3F3F"/>
-          <w:sz w:val="21"/>
-          <w:szCs w:val="21"/>
-        </w:rPr>
-        <w:t xml:space="preserve"> — kein Verkauf an Dritte. Der Lohn läuft aktuell im Testbetrieb parallel zum bisherigen Lohnsystem (Mirus); scharfer Betrieb ab 1.1.2027.</w:t>
+        <w:t xml:space="preserve">Eigenentwicklung — zunächst für den Eigengebrauch.</w:t>
+      </w:r>
+      <w:r>
+        <w:rPr>
+          <w:color w:val="3F3F3F"/>
+          <w:sz w:val="21"/>
+          <w:szCs w:val="21"/>
+        </w:rPr>
+        <w:t xml:space="preserve"> Mittelfristig ist die Lizenzierung an weitere McDonald’s-Franchisenehmer geplant (Potenzial rund 100 Restaurants mit identischem Geschäftsmodell). Der Lohn läuft aktuell im Testbetrieb parallel zum bisherigen Lohnsystem (Mirus); scharfer Betrieb ab 1.1.2027.</w:t>
       </w:r>
     </w:p>
     <w:p>
@@ -644,7 +644,6 @@
     <w:p>
       <w:pPr>
         <w:pStyle w:val="Heading1"/>
-        <w:pageBreakBefore/>
         <w:spacing w:after="120" w:before="260"/>
       </w:pPr>
       <w:r>
@@ -731,15 +730,15 @@
           <w:sz w:val="21"/>
           <w:szCs w:val="21"/>
         </w:rPr>
-        <w:t xml:space="preserve">Umfang / Staffelung: </w:t>
-      </w:r>
-      <w:r>
-        <w:rPr>
-          <w:color w:val="3F3F3F"/>
-          <w:sz w:val="21"/>
-          <w:szCs w:val="21"/>
-        </w:rPr>
-        <w:t xml:space="preserve">Können wir den Zertifizierungsumfang auf unsere Domänen beschränken (AHV, FAK, UVG/UVGZ/KTG, BVG, Lohnausweis, QST, Statistik)? Ist eine gestaffelte Zertifizierung möglich — zuerst Jahresmeldung, später QST-Monatsmeldung?</w:t>
+        <w:t xml:space="preserve">Umfang «volles Programm»: </w:t>
+      </w:r>
+      <w:r>
+        <w:rPr>
+          <w:color w:val="3F3F3F"/>
+          <w:sz w:val="21"/>
+          <w:szCs w:val="21"/>
+        </w:rPr>
+        <w:t xml:space="preserve">Uns ist bekannt, dass es nur EIN Zertifizierungsverfahren gibt. Was heisst das konkret — sind auch Domänen zwingend, die wir nicht nutzen (z.B. Grenzgänger-Meldungen FR)? Wie läuft die Prüfung ab (Slots, Dauer, Nachprüfung bei Beanstandungen)?</w:t>
       </w:r>
     </w:p>
     <w:p>
@@ -759,15 +758,15 @@
           <w:sz w:val="21"/>
           <w:szCs w:val="21"/>
         </w:rPr>
-        <w:t xml:space="preserve">Status Eigenentwicklung: </w:t>
-      </w:r>
-      <w:r>
-        <w:rPr>
-          <w:color w:val="3F3F3F"/>
-          <w:sz w:val="21"/>
-          <w:szCs w:val="21"/>
-        </w:rPr>
-        <w:t xml:space="preserve">OneCrew wird nur für die eigene Firma eingesetzt (eine UID, kein Vertrieb). Gibt es dafür einen vereinfachten Weg oder gelten dieselben Anforderungen wie für kommerzielle ERP-Hersteller?</w:t>
+        <w:t xml:space="preserve">Perspektive Lizenzierung: </w:t>
+      </w:r>
+      <w:r>
+        <w:rPr>
+          <w:color w:val="3F3F3F"/>
+          <w:sz w:val="21"/>
+          <w:szCs w:val="21"/>
+        </w:rPr>
+        <w:t xml:space="preserve">OneCrew startet im Eigengebrauch (eine UID); mittelfristig ist die Lizenzierung an weitere McDonald’s-Franchisenehmer geplant (~100 Restaurants). Was bedeutet das für Vereinbarung und Zertifikat — Hersteller-Status, mehrere UIDs/Mandanten über denselben zertifizierten Transmitter, separate Instanzen pro Kunde?</w:t>
       </w:r>
     </w:p>
     <w:p>
@@ -1007,7 +1006,7 @@
           <w:sz w:val="21"/>
           <w:szCs w:val="21"/>
         </w:rPr>
-        <w:t xml:space="preserve">OneCrew — Eigenentwicklung, Einsatz nur für die eigene Rechtseinheit</w:t>
+        <w:t xml:space="preserve">OneCrew — Eigenentwicklung; zunächst eigene Rechtseinheit, mittelfristig Lizenzierung an weitere Franchisenehmer geplant</w:t>
       </w:r>
     </w:p>
     <w:p>

</xml_diff>